<commit_message>
v1.1: cite adjacent underwater-metamaterial literature, date the gap claim, clean metadata
Section 4.2 described spiral-based and coiled underwater absorbers without
citations; v1.1 cites them (Applied Materials Today 2021 reconfigurable
spiral metasurfaces; Scientific Reports 2023 space-coiled absorber;
Science Advances impedance-matched composite) and records an August 2026
targeted search that again found no published test of scale invariance as
the source of multi-octave underwater bandwidth - the central question
stands. Metadata: v1.1, RELEASED, origin context cleaned.
</commit_message>
<xml_diff>
--- a/The_Spiral_and_the_Wave_White_Paper.docx
+++ b/The_Spiral_and_the_Wave_White_Paper.docx
@@ -2224,7 +2224,7 @@
         <w:spacing w:after="200"/>
       </w:pPr>
       <w:r>
-        <w:t>Active research exists on underwater acoustic metamaterials, including spiral-based designs. Recent work includes spiral resonators embedded in polyurethane matrices, space-coiled water channels with rubber coatings, and various local-resonance structures. These approaches have achieved varying degrees of success at low frequencies, though typically with narrower bandwidths than the electromagnetic case.</w:t>
+        <w:t>Active research exists on underwater acoustic metamaterials, including spiral-based designs. Recent work includes reconfigurable spiral underwater sound-absorbing metasurfaces (Applied Materials Today, 2021), ultrathin space-coiled water-channel absorbers achieving near-perfect but narrowband low-frequency absorption (Scientific Reports, 2023), and impedance-matched composite absorbers (Science Advances). These approaches have achieved varying degrees of success at low frequencies, though typically with far narrower bandwidths than the electromagnetic case. Full citations are given in the References.</w:t>
       </w:r>
     </w:p>
     <w:p>
@@ -2240,7 +2240,7 @@
         <w:spacing w:after="200"/>
       </w:pPr>
       <w:r>
-        <w:t>This gap is either an oversight in the literature search, a result that exists but has not been published, or an experiment that has not been done.</w:t>
+        <w:t>This gap is either an oversight in the literature search, a result that exists but has not been published, or an experiment that has not been done. A further targeted search in August 2026 again found spiral-based and coiled underwater absorbers, but no published test of the scale-invariance mechanism as the source of multi-octave underwater bandwidth.</w:t>
       </w:r>
     </w:p>
     <w:p>
@@ -2731,6 +2731,42 @@
           <w:iCs/>
         </w:rPr>
         <w:t>This paper is open access and freely available. Anyone interested in this concept is encouraged to read it directly.</w:t>
+      </w:r>
+    </w:p>
+    <w:p>
+      <w:pPr>
+        <w:spacing w:after="200"/>
+      </w:pPr>
+      <w:r>
+        <w:rPr>
+          <w:i/>
+          <w:iCs/>
+        </w:rPr>
+        <w:t>“Reconfigurable spiral underwater sound-absorbing metasurfaces.” Applied Materials Today (2021). ScienceDirect PII S2352431621001115.</w:t>
+      </w:r>
+    </w:p>
+    <w:p>
+      <w:pPr>
+        <w:spacing w:after="200"/>
+      </w:pPr>
+      <w:r>
+        <w:rPr>
+          <w:i/>
+          <w:iCs/>
+        </w:rPr>
+        <w:t>“Ultrathin acoustic metamaterial as super absorber for broadband low-frequency underwater sound.” Scientific Reports 13 (2023). doi:10.1038/s41598-023-34993-0.</w:t>
+      </w:r>
+    </w:p>
+    <w:p>
+      <w:pPr>
+        <w:spacing w:after="200"/>
+      </w:pPr>
+      <w:r>
+        <w:rPr>
+          <w:i/>
+          <w:iCs/>
+        </w:rPr>
+        <w:t>“Underwater metamaterial absorber with impedance-matched composite.” Science Advances. doi:10.1126/sciadv.abm4206.</w:t>
       </w:r>
     </w:p>
     <w:p>
@@ -3517,7 +3553,7 @@
                 <w:sz w:val="20"/>
                 <w:szCs w:val="20"/>
               </w:rPr>
-              <w:t>1.0</w:t>
+              <w:t>1.1</w:t>
             </w:r>
           </w:p>
         </w:tc>
@@ -3559,7 +3595,7 @@
                 <w:sz w:val="20"/>
                 <w:szCs w:val="20"/>
               </w:rPr>
-              <w:t>01 January 2026</w:t>
+              <w:t>8 August 2026 (v1.1)</w:t>
             </w:r>
           </w:p>
         </w:tc>
@@ -3643,7 +3679,7 @@
                 <w:sz w:val="20"/>
                 <w:szCs w:val="20"/>
               </w:rPr>
-              <w:t>Desk Research and Technical Analysis</w:t>
+              <w:t>Independent inquiry, revised under adversarial review</w:t>
             </w:r>
           </w:p>
         </w:tc>
@@ -3769,7 +3805,7 @@
                 <w:sz w:val="20"/>
                 <w:szCs w:val="20"/>
               </w:rPr>
-              <w:t>Draft</w:t>
+              <w:t>RELEASED</w:t>
             </w:r>
           </w:p>
         </w:tc>

</xml_diff>